<commit_message>
Auto update weekly strength plan and articles
</commit_message>
<xml_diff>
--- a/docs/weekly/2026-W38_當週鐵人新知與文章整理.docx
+++ b/docs/weekly/2026-W38_當週鐵人新知與文章整理.docx
@@ -27,7 +27,7 @@
           <w:color w:val="555555"/>
           <w:sz w:val="19"/>
         </w:rPr>
-        <w:t>彙整時間：2026-09-14 07:06:22　｜　時間範圍：過去 7 天</w:t>
+        <w:t>彙整時間：2026-09-14 12:57:46　｜　時間範圍：過去 7 天</w:t>
         <w:br/>
         <w:t>來源網站：Slowtwitch, Triathlete, 220 Triathlon, TrainingPeaks, Joe Friel</w:t>
       </w:r>
@@ -804,50 +804,6 @@
     <w:p>
       <w:pPr>
         <w:keepNext/>
-        <w:spacing w:before="160" w:after="40"/>
-      </w:pPr>
-      <w:r>
-        <w:rPr>
-          <w:rFonts w:ascii="Calibri" w:hAnsi="Calibri" w:eastAsia="Microsoft JhengHei"/>
-          <w:b/>
-          <w:color w:val="595959"/>
-          <w:sz w:val="19"/>
-        </w:rPr>
-        <w:t xml:space="preserve">【Triathlete Magazine | 2026-09-07】 </w:t>
-      </w:r>
-      <w:hyperlink w:rId="rId28">
-        <w:r>
-          <w:rPr>
-            <w:color w:val="1F4D78"/>
-            <w:u w:val="single"/>
-            <w:b/>
-            <w:rFonts w:ascii="Calibri" w:hAnsi="Calibri" w:eastAsia="Microsoft JhengHei"/>
-            <w:sz w:val="22"/>
-          </w:rPr>
-          <w:t>Cassandre Beaugrand and Matt Hauser Earn the Biggest One-Day Paycheck in Triathlon at Supertri Pro Series Final</w:t>
-        </w:r>
-      </w:hyperlink>
-    </w:p>
-    <w:p>
-      <w:pPr>
-        <w:spacing w:after="200"/>
-        <w:ind w:left="360"/>
-      </w:pPr>
-      <w:r>
-        <w:rPr>
-          <w:rFonts w:ascii="Calibri" w:hAnsi="Calibri" w:eastAsia="Microsoft JhengHei"/>
-          <w:b w:val="0"/>
-          <w:color w:val="444444"/>
-          <w:sz w:val="19"/>
-        </w:rPr>
-        <w:t>In the final race of the newly reformatted 2026 Supertri Pro Series, Cassandre Beaugrand and Matt Hauser stormed away on the final run to earn $100,000 each.</w:t>
-        <w:br/>
-        <w:t>Read the full article at Cassandre Beaugra...</w:t>
-      </w:r>
-    </w:p>
-    <w:p>
-      <w:pPr>
-        <w:keepNext/>
         <w:spacing w:before="320" w:after="160"/>
       </w:pPr>
       <w:r>
@@ -874,7 +830,7 @@
         </w:rPr>
         <w:t xml:space="preserve">【Slowtwitch | 2026-09-13】 </w:t>
       </w:r>
-      <w:hyperlink w:rId="rId29">
+      <w:hyperlink w:rId="rId28">
         <w:r>
           <w:rPr>
             <w:color w:val="1F4D78"/>
@@ -918,7 +874,7 @@
         </w:rPr>
         <w:t xml:space="preserve">【Slowtwitch | 2026-09-13】 </w:t>
       </w:r>
-      <w:hyperlink w:rId="rId30">
+      <w:hyperlink w:rId="rId29">
         <w:r>
           <w:rPr>
             <w:color w:val="1F4D78"/>
@@ -962,7 +918,7 @@
         </w:rPr>
         <w:t xml:space="preserve">【Slowtwitch | 2026-09-13】 </w:t>
       </w:r>
-      <w:hyperlink w:rId="rId31">
+      <w:hyperlink w:rId="rId30">
         <w:r>
           <w:rPr>
             <w:color w:val="1F4D78"/>
@@ -1006,7 +962,7 @@
         </w:rPr>
         <w:t xml:space="preserve">【220 Triathlon | 2026-09-13】 </w:t>
       </w:r>
-      <w:hyperlink w:rId="rId32">
+      <w:hyperlink w:rId="rId31">
         <w:r>
           <w:rPr>
             <w:color w:val="1F4D78"/>
@@ -1048,7 +1004,7 @@
         </w:rPr>
         <w:t xml:space="preserve">【Slowtwitch | 2026-09-12】 </w:t>
       </w:r>
-      <w:hyperlink w:rId="rId33">
+      <w:hyperlink w:rId="rId32">
         <w:r>
           <w:rPr>
             <w:color w:val="1F4D78"/>
@@ -1092,7 +1048,7 @@
         </w:rPr>
         <w:t xml:space="preserve">【Slowtwitch | 2026-09-12】 </w:t>
       </w:r>
-      <w:hyperlink w:rId="rId34">
+      <w:hyperlink w:rId="rId33">
         <w:r>
           <w:rPr>
             <w:color w:val="1F4D78"/>
@@ -1136,7 +1092,7 @@
         </w:rPr>
         <w:t xml:space="preserve">【Slowtwitch | 2026-09-12】 </w:t>
       </w:r>
-      <w:hyperlink w:rId="rId35">
+      <w:hyperlink w:rId="rId34">
         <w:r>
           <w:rPr>
             <w:color w:val="1F4D78"/>
@@ -1180,7 +1136,7 @@
         </w:rPr>
         <w:t xml:space="preserve">【TrainingPeaks Blog | 2026-09-12】 </w:t>
       </w:r>
-      <w:hyperlink w:rId="rId36">
+      <w:hyperlink w:rId="rId35">
         <w:r>
           <w:rPr>
             <w:color w:val="1F4D78"/>
@@ -1224,7 +1180,7 @@
         </w:rPr>
         <w:t xml:space="preserve">【Slowtwitch | 2026-09-12】 </w:t>
       </w:r>
-      <w:hyperlink w:rId="rId37">
+      <w:hyperlink w:rId="rId36">
         <w:r>
           <w:rPr>
             <w:color w:val="1F4D78"/>
@@ -1268,7 +1224,7 @@
         </w:rPr>
         <w:t xml:space="preserve">【Triathlete Magazine | 2026-09-11】 </w:t>
       </w:r>
-      <w:hyperlink w:rId="rId38">
+      <w:hyperlink w:rId="rId37">
         <w:r>
           <w:rPr>
             <w:color w:val="1F4D78"/>
@@ -1312,7 +1268,7 @@
         </w:rPr>
         <w:t xml:space="preserve">【220 Triathlon | 2026-09-11】 </w:t>
       </w:r>
-      <w:hyperlink w:rId="rId39">
+      <w:hyperlink w:rId="rId38">
         <w:r>
           <w:rPr>
             <w:color w:val="1F4D78"/>
@@ -1354,7 +1310,7 @@
         </w:rPr>
         <w:t xml:space="preserve">【Triathlete Magazine | 2026-09-11】 </w:t>
       </w:r>
-      <w:hyperlink w:rId="rId40">
+      <w:hyperlink w:rId="rId39">
         <w:r>
           <w:rPr>
             <w:color w:val="1F4D78"/>
@@ -1398,7 +1354,7 @@
         </w:rPr>
         <w:t xml:space="preserve">【220 Triathlon | 2026-09-11】 </w:t>
       </w:r>
-      <w:hyperlink w:rId="rId41">
+      <w:hyperlink w:rId="rId40">
         <w:r>
           <w:rPr>
             <w:color w:val="1F4D78"/>
@@ -1440,7 +1396,7 @@
         </w:rPr>
         <w:t xml:space="preserve">【220 Triathlon | 2026-09-10】 </w:t>
       </w:r>
-      <w:hyperlink w:rId="rId42">
+      <w:hyperlink w:rId="rId41">
         <w:r>
           <w:rPr>
             <w:color w:val="1F4D78"/>
@@ -1482,7 +1438,7 @@
         </w:rPr>
         <w:t xml:space="preserve">【220 Triathlon | 2026-09-10】 </w:t>
       </w:r>
-      <w:hyperlink w:rId="rId43">
+      <w:hyperlink w:rId="rId42">
         <w:r>
           <w:rPr>
             <w:color w:val="1F4D78"/>
@@ -1524,7 +1480,7 @@
         </w:rPr>
         <w:t xml:space="preserve">【Triathlete Magazine | 2026-09-09】 </w:t>
       </w:r>
-      <w:hyperlink w:rId="rId44">
+      <w:hyperlink w:rId="rId43">
         <w:r>
           <w:rPr>
             <w:color w:val="1F4D78"/>
@@ -1566,7 +1522,7 @@
         </w:rPr>
         <w:t xml:space="preserve">【220 Triathlon | 2026-09-09】 </w:t>
       </w:r>
-      <w:hyperlink w:rId="rId45">
+      <w:hyperlink w:rId="rId44">
         <w:r>
           <w:rPr>
             <w:color w:val="1F4D78"/>
@@ -1608,7 +1564,7 @@
         </w:rPr>
         <w:t xml:space="preserve">【220 Triathlon | 2026-09-09】 </w:t>
       </w:r>
-      <w:hyperlink w:rId="rId46">
+      <w:hyperlink w:rId="rId45">
         <w:r>
           <w:rPr>
             <w:color w:val="1F4D78"/>
@@ -1650,7 +1606,7 @@
         </w:rPr>
         <w:t xml:space="preserve">【TrainingPeaks Blog | 2026-09-09】 </w:t>
       </w:r>
-      <w:hyperlink w:rId="rId47">
+      <w:hyperlink w:rId="rId46">
         <w:r>
           <w:rPr>
             <w:color w:val="1F4D78"/>
@@ -1694,7 +1650,7 @@
         </w:rPr>
         <w:t xml:space="preserve">【Triathlete Magazine | 2026-09-09】 </w:t>
       </w:r>
-      <w:hyperlink w:rId="rId48">
+      <w:hyperlink w:rId="rId47">
         <w:r>
           <w:rPr>
             <w:color w:val="1F4D78"/>
@@ -1738,7 +1694,7 @@
         </w:rPr>
         <w:t xml:space="preserve">【220 Triathlon | 2026-09-07】 </w:t>
       </w:r>
-      <w:hyperlink w:rId="rId49">
+      <w:hyperlink w:rId="rId48">
         <w:r>
           <w:rPr>
             <w:color w:val="1F4D78"/>

</xml_diff>